<commit_message>
feat: implement hero section and engineering philosophy components with updated portfolio assets
</commit_message>
<xml_diff>
--- a/public/cv.docx
+++ b/public/cv.docx
@@ -16,7 +16,7 @@
           <w:rFonts w:asciiTheme="majorHAnsi" w:hAnsiTheme="majorHAnsi" w:cstheme="majorHAnsi"/>
           <w:sz w:val="32"/>
         </w:rPr>
-        <w:t>Anmol Chhetri</w:t>
+        <w:t>Anupam Baral</w:t>
       </w:r>
     </w:p>
     <w:p>
@@ -55,7 +55,13 @@
         <w:rPr>
           <w:rFonts w:asciiTheme="majorHAnsi" w:hAnsiTheme="majorHAnsi" w:cstheme="majorHAnsi"/>
         </w:rPr>
-        <w:t>+977 9748809637</w:t>
+        <w:t xml:space="preserve">+977 </w:t>
+      </w:r>
+      <w:r>
+        <w:rPr>
+          <w:rFonts w:asciiTheme="majorHAnsi" w:hAnsiTheme="majorHAnsi" w:cstheme="majorHAnsi"/>
+        </w:rPr>
+        <w:t>9767606302</w:t>
       </w:r>
     </w:p>
     <w:p>
@@ -72,7 +78,7 @@
             <w:rStyle w:val="Hyperlink"/>
             <w:rFonts w:asciiTheme="majorHAnsi" w:hAnsiTheme="majorHAnsi" w:cstheme="majorHAnsi"/>
           </w:rPr>
-          <w:t>ambassador.anmol@nicnepal.org</w:t>
+          <w:t>baralanupam111@gmail.com</w:t>
         </w:r>
       </w:hyperlink>
       <w:r>
@@ -133,7 +139,15 @@
           <w:szCs w:val="24"/>
           <w:lang w:val="en"/>
         </w:rPr>
-        <w:t>com/in/anmolchhetri</w:t>
+        <w:t>com/in/</w:t>
+      </w:r>
+      <w:r>
+        <w:rPr>
+          <w:rFonts w:asciiTheme="majorHAnsi" w:hAnsiTheme="majorHAnsi" w:cstheme="majorHAnsi"/>
+          <w:szCs w:val="24"/>
+          <w:lang w:val="en"/>
+        </w:rPr>
+        <w:t>gomugomucode</w:t>
       </w:r>
     </w:p>
     <w:p>
@@ -335,7 +349,7 @@
           <w:iCs/>
           <w:sz w:val="24"/>
         </w:rPr>
-        <w:t>anmol.info</w:t>
+        <w:t>anupam</w:t>
       </w:r>
       <w:r>
         <w:rPr>
@@ -346,100 +360,122 @@
           <w:iCs/>
           <w:sz w:val="24"/>
         </w:rPr>
-        <w:t>.np</w:t>
-      </w:r>
-    </w:p>
-    <w:p>
-      <w:pPr>
-        <w:spacing w:after="0" w:line="240" w:lineRule="auto"/>
-        <w:rPr>
-          <w:rFonts w:asciiTheme="majorHAnsi" w:hAnsiTheme="majorHAnsi" w:cstheme="majorHAnsi"/>
-          <w:sz w:val="24"/>
-        </w:rPr>
-      </w:pPr>
-    </w:p>
-    <w:p>
-      <w:pPr>
-        <w:spacing w:after="0" w:line="240" w:lineRule="auto"/>
-        <w:rPr>
-          <w:rFonts w:asciiTheme="majorHAnsi" w:hAnsiTheme="majorHAnsi" w:cstheme="majorHAnsi"/>
-          <w:sz w:val="24"/>
-        </w:rPr>
-      </w:pPr>
-    </w:p>
-    <w:p>
-      <w:pPr>
-        <w:spacing w:after="0" w:line="240" w:lineRule="auto"/>
-        <w:rPr>
-          <w:rFonts w:asciiTheme="majorHAnsi" w:hAnsiTheme="majorHAnsi" w:cstheme="majorHAnsi"/>
-          <w:sz w:val="24"/>
-        </w:rPr>
-      </w:pPr>
-      <w:r>
-        <w:rPr>
-          <w:rFonts w:asciiTheme="majorHAnsi" w:hAnsiTheme="majorHAnsi" w:cstheme="majorHAnsi"/>
-          <w:sz w:val="24"/>
-        </w:rPr>
-        <w:t xml:space="preserve">Dear </w:t>
-      </w:r>
-      <w:r>
-        <w:rPr>
-          <w:rFonts w:asciiTheme="majorHAnsi" w:hAnsiTheme="majorHAnsi" w:cstheme="majorHAnsi"/>
-          <w:sz w:val="24"/>
-        </w:rPr>
-        <w:t>Sir/Madam,</w:t>
-      </w:r>
-    </w:p>
-    <w:p>
-      <w:pPr>
-        <w:spacing w:after="0" w:line="240" w:lineRule="auto"/>
-        <w:rPr>
-          <w:rFonts w:asciiTheme="majorHAnsi" w:hAnsiTheme="majorHAnsi" w:cstheme="majorHAnsi"/>
-          <w:sz w:val="24"/>
-        </w:rPr>
-      </w:pPr>
-    </w:p>
-    <w:p>
-      <w:pPr>
-        <w:spacing w:after="0" w:line="240" w:lineRule="auto"/>
-        <w:rPr>
-          <w:rFonts w:asciiTheme="majorHAnsi" w:hAnsiTheme="majorHAnsi" w:cstheme="majorHAnsi"/>
-          <w:sz w:val="24"/>
-        </w:rPr>
-      </w:pPr>
-    </w:p>
-    <w:p>
-      <w:pPr>
-        <w:spacing w:after="0" w:line="240" w:lineRule="auto"/>
-        <w:rPr>
-          <w:rFonts w:asciiTheme="majorHAnsi" w:hAnsiTheme="majorHAnsi" w:cstheme="majorHAnsi"/>
-          <w:sz w:val="24"/>
-        </w:rPr>
-      </w:pPr>
-    </w:p>
-    <w:p>
-      <w:pPr>
-        <w:spacing w:after="0" w:line="240" w:lineRule="auto"/>
-        <w:rPr>
-          <w:rFonts w:asciiTheme="majorHAnsi" w:hAnsiTheme="majorHAnsi" w:cstheme="majorHAnsi"/>
-          <w:sz w:val="24"/>
-        </w:rPr>
-      </w:pPr>
-      <w:r>
-        <w:rPr>
-          <w:rFonts w:asciiTheme="majorHAnsi" w:hAnsiTheme="majorHAnsi" w:cstheme="majorHAnsi"/>
-          <w:sz w:val="24"/>
-        </w:rPr>
-        <w:t xml:space="preserve">I am writing to kindly request the registration of the domain </w:t>
+        <w:t>.info</w:t>
       </w:r>
       <w:r>
         <w:rPr>
           <w:rFonts w:asciiTheme="majorHAnsi" w:hAnsiTheme="majorHAnsi" w:cstheme="majorHAnsi"/>
           <w:b/>
           <w:bCs/>
-          <w:sz w:val="24"/>
-        </w:rPr>
-        <w:t>anmol.info</w:t>
+          <w:i/>
+          <w:iCs/>
+          <w:sz w:val="24"/>
+        </w:rPr>
+        <w:t>.np</w:t>
+      </w:r>
+    </w:p>
+    <w:p>
+      <w:pPr>
+        <w:spacing w:after="0" w:line="240" w:lineRule="auto"/>
+        <w:rPr>
+          <w:rFonts w:asciiTheme="majorHAnsi" w:hAnsiTheme="majorHAnsi" w:cstheme="majorHAnsi"/>
+          <w:sz w:val="24"/>
+        </w:rPr>
+      </w:pPr>
+    </w:p>
+    <w:p>
+      <w:pPr>
+        <w:spacing w:after="0" w:line="240" w:lineRule="auto"/>
+        <w:rPr>
+          <w:rFonts w:asciiTheme="majorHAnsi" w:hAnsiTheme="majorHAnsi" w:cstheme="majorHAnsi"/>
+          <w:sz w:val="24"/>
+        </w:rPr>
+      </w:pPr>
+    </w:p>
+    <w:p>
+      <w:pPr>
+        <w:spacing w:after="0" w:line="240" w:lineRule="auto"/>
+        <w:rPr>
+          <w:rFonts w:asciiTheme="majorHAnsi" w:hAnsiTheme="majorHAnsi" w:cstheme="majorHAnsi"/>
+          <w:sz w:val="24"/>
+        </w:rPr>
+      </w:pPr>
+      <w:r>
+        <w:rPr>
+          <w:rFonts w:asciiTheme="majorHAnsi" w:hAnsiTheme="majorHAnsi" w:cstheme="majorHAnsi"/>
+          <w:sz w:val="24"/>
+        </w:rPr>
+        <w:t xml:space="preserve">Dear </w:t>
+      </w:r>
+      <w:r>
+        <w:rPr>
+          <w:rFonts w:asciiTheme="majorHAnsi" w:hAnsiTheme="majorHAnsi" w:cstheme="majorHAnsi"/>
+          <w:sz w:val="24"/>
+        </w:rPr>
+        <w:t>Sir/Madam,</w:t>
+      </w:r>
+    </w:p>
+    <w:p>
+      <w:pPr>
+        <w:spacing w:after="0" w:line="240" w:lineRule="auto"/>
+        <w:rPr>
+          <w:rFonts w:asciiTheme="majorHAnsi" w:hAnsiTheme="majorHAnsi" w:cstheme="majorHAnsi"/>
+          <w:sz w:val="24"/>
+        </w:rPr>
+      </w:pPr>
+    </w:p>
+    <w:p>
+      <w:pPr>
+        <w:spacing w:after="0" w:line="240" w:lineRule="auto"/>
+        <w:rPr>
+          <w:rFonts w:asciiTheme="majorHAnsi" w:hAnsiTheme="majorHAnsi" w:cstheme="majorHAnsi"/>
+          <w:sz w:val="24"/>
+        </w:rPr>
+      </w:pPr>
+    </w:p>
+    <w:p>
+      <w:pPr>
+        <w:spacing w:after="0" w:line="240" w:lineRule="auto"/>
+        <w:rPr>
+          <w:rFonts w:asciiTheme="majorHAnsi" w:hAnsiTheme="majorHAnsi" w:cstheme="majorHAnsi"/>
+          <w:sz w:val="24"/>
+        </w:rPr>
+      </w:pPr>
+    </w:p>
+    <w:p>
+      <w:pPr>
+        <w:spacing w:after="0" w:line="240" w:lineRule="auto"/>
+        <w:rPr>
+          <w:rFonts w:asciiTheme="majorHAnsi" w:hAnsiTheme="majorHAnsi" w:cstheme="majorHAnsi"/>
+          <w:sz w:val="24"/>
+        </w:rPr>
+      </w:pPr>
+      <w:r>
+        <w:rPr>
+          <w:rFonts w:asciiTheme="majorHAnsi" w:hAnsiTheme="majorHAnsi" w:cstheme="majorHAnsi"/>
+          <w:sz w:val="24"/>
+        </w:rPr>
+        <w:t xml:space="preserve">I am writing to kindly request the registration of the domain </w:t>
+      </w:r>
+      <w:r>
+        <w:rPr>
+          <w:rFonts w:asciiTheme="majorHAnsi" w:hAnsiTheme="majorHAnsi" w:cstheme="majorHAnsi"/>
+          <w:b/>
+          <w:bCs/>
+          <w:i/>
+          <w:iCs/>
+          <w:sz w:val="24"/>
+        </w:rPr>
+        <w:t>anupam</w:t>
+      </w:r>
+      <w:r>
+        <w:rPr>
+          <w:rFonts w:asciiTheme="majorHAnsi" w:hAnsiTheme="majorHAnsi" w:cstheme="majorHAnsi"/>
+          <w:b/>
+          <w:bCs/>
+          <w:sz w:val="24"/>
+        </w:rPr>
+        <w:t>.info</w:t>
       </w:r>
       <w:r>
         <w:rPr>
@@ -590,7 +626,7 @@
           <w:sz w:val="24"/>
         </w:rPr>
         <w:drawing>
-          <wp:inline distT="0" distB="0" distL="0" distR="0" wp14:anchorId="02F85142" wp14:editId="0FD4A3F2">
+          <wp:inline distT="0" distB="0" distL="0" distR="0" wp14:anchorId="02F85142" wp14:editId="3EDE29F9">
             <wp:extent cx="835219" cy="855345"/>
             <wp:effectExtent l="8890" t="0" r="0" b="0"/>
             <wp:docPr id="1125015187" name="Picture 2"/>
@@ -674,7 +710,7 @@
           <w:rFonts w:asciiTheme="majorHAnsi" w:hAnsiTheme="majorHAnsi" w:cstheme="majorHAnsi"/>
           <w:sz w:val="24"/>
         </w:rPr>
-        <w:t>Anmol Chhetri</w:t>
+        <w:t>Anupam Baral</w:t>
       </w:r>
     </w:p>
     <w:sectPr>
@@ -1532,6 +1568,25 @@
 </file>
 
 <file path=customXml/item1.xml><?xml version="1.0" encoding="utf-8"?>
+<?mso-contentType ?>
+<FormTemplates xmlns="http://schemas.microsoft.com/sharepoint/v3/contenttype/forms">
+  <Display>DocumentLibraryForm</Display>
+  <Edit>DocumentLibraryForm</Edit>
+  <New>DocumentLibraryForm</New>
+</FormTemplates>
+</file>
+
+<file path=customXml/item2.xml><?xml version="1.0" encoding="utf-8"?>
+<p:properties xmlns:p="http://schemas.microsoft.com/office/2006/metadata/properties" xmlns:xsi="http://www.w3.org/2001/XMLSchema-instance" xmlns:pc="http://schemas.microsoft.com/office/infopath/2007/PartnerControls">
+  <documentManagement>
+    <lcf76f155ced4ddcb4097134ff3c332f xmlns="e9d15892-5b68-4418-a3e7-94427c2a91b4">
+      <Terms xmlns="http://schemas.microsoft.com/office/infopath/2007/PartnerControls"/>
+    </lcf76f155ced4ddcb4097134ff3c332f>
+  </documentManagement>
+</p:properties>
+</file>
+
+<file path=customXml/item3.xml><?xml version="1.0" encoding="utf-8"?>
 <ct:contentTypeSchema xmlns:ct="http://schemas.microsoft.com/office/2006/metadata/contentType" xmlns:ma="http://schemas.microsoft.com/office/2006/metadata/properties/metaAttributes" ct:_="" ma:_="" ma:contentTypeName="Document" ma:contentTypeID="0x010100A2ACBB9FCEFE2543B7068647E9F301B8" ma:contentTypeVersion="12" ma:contentTypeDescription="Create a new document." ma:contentTypeScope="" ma:versionID="4a190584ab1f0b4a071fdd8039167ff7">
   <xsd:schema xmlns:xsd="http://www.w3.org/2001/XMLSchema" xmlns:xs="http://www.w3.org/2001/XMLSchema" xmlns:p="http://schemas.microsoft.com/office/2006/metadata/properties" xmlns:ns2="e9d15892-5b68-4418-a3e7-94427c2a91b4" xmlns:ns3="8851173a-489b-41f8-8665-fd4abe8d6f4a" targetNamespace="http://schemas.microsoft.com/office/2006/metadata/properties" ma:root="true" ma:fieldsID="25afec4e0b55378dd4c113ee1c72b34a" ns2:_="" ns3:_="">
     <xsd:import namespace="e9d15892-5b68-4418-a3e7-94427c2a91b4"/>
@@ -1742,26 +1797,25 @@
 </ct:contentTypeSchema>
 </file>
 
-<file path=customXml/item2.xml><?xml version="1.0" encoding="utf-8"?>
-<p:properties xmlns:p="http://schemas.microsoft.com/office/2006/metadata/properties" xmlns:xsi="http://www.w3.org/2001/XMLSchema-instance" xmlns:pc="http://schemas.microsoft.com/office/infopath/2007/PartnerControls">
-  <documentManagement>
-    <lcf76f155ced4ddcb4097134ff3c332f xmlns="e9d15892-5b68-4418-a3e7-94427c2a91b4">
-      <Terms xmlns="http://schemas.microsoft.com/office/infopath/2007/PartnerControls"/>
-    </lcf76f155ced4ddcb4097134ff3c332f>
-  </documentManagement>
-</p:properties>
+<file path=customXml/itemProps1.xml><?xml version="1.0" encoding="utf-8"?>
+<ds:datastoreItem xmlns:ds="http://schemas.openxmlformats.org/officeDocument/2006/customXml" ds:itemID="{DC8551FE-7FF0-4CCB-9CCF-13B976D5D205}">
+  <ds:schemaRefs>
+    <ds:schemaRef ds:uri="http://schemas.microsoft.com/sharepoint/v3/contenttype/forms"/>
+  </ds:schemaRefs>
+</ds:datastoreItem>
 </file>
 
-<file path=customXml/item3.xml><?xml version="1.0" encoding="utf-8"?>
-<?mso-contentType ?>
-<FormTemplates xmlns="http://schemas.microsoft.com/sharepoint/v3/contenttype/forms">
-  <Display>DocumentLibraryForm</Display>
-  <Edit>DocumentLibraryForm</Edit>
-  <New>DocumentLibraryForm</New>
-</FormTemplates>
+<file path=customXml/itemProps2.xml><?xml version="1.0" encoding="utf-8"?>
+<ds:datastoreItem xmlns:ds="http://schemas.openxmlformats.org/officeDocument/2006/customXml" ds:itemID="{1AC196E0-4040-4409-86F2-0E03E7EA1978}">
+  <ds:schemaRefs>
+    <ds:schemaRef ds:uri="http://schemas.microsoft.com/office/2006/metadata/properties"/>
+    <ds:schemaRef ds:uri="http://schemas.microsoft.com/office/infopath/2007/PartnerControls"/>
+    <ds:schemaRef ds:uri="e9d15892-5b68-4418-a3e7-94427c2a91b4"/>
+  </ds:schemaRefs>
+</ds:datastoreItem>
 </file>
 
-<file path=customXml/itemProps1.xml><?xml version="1.0" encoding="utf-8"?>
+<file path=customXml/itemProps3.xml><?xml version="1.0" encoding="utf-8"?>
 <ds:datastoreItem xmlns:ds="http://schemas.openxmlformats.org/officeDocument/2006/customXml" ds:itemID="{51D6282A-BA2F-4D8B-87BF-6A18D41D1984}">
   <ds:schemaRefs>
     <ds:schemaRef ds:uri="http://schemas.microsoft.com/office/2006/metadata/contentType"/>
@@ -1778,22 +1832,4 @@
     <ds:schemaRef ds:uri="http://schemas.microsoft.com/internal/obd"/>
   </ds:schemaRefs>
 </ds:datastoreItem>
-</file>
-
-<file path=customXml/itemProps2.xml><?xml version="1.0" encoding="utf-8"?>
-<ds:datastoreItem xmlns:ds="http://schemas.openxmlformats.org/officeDocument/2006/customXml" ds:itemID="{1AC196E0-4040-4409-86F2-0E03E7EA1978}">
-  <ds:schemaRefs>
-    <ds:schemaRef ds:uri="http://schemas.microsoft.com/office/2006/metadata/properties"/>
-    <ds:schemaRef ds:uri="http://schemas.microsoft.com/office/infopath/2007/PartnerControls"/>
-    <ds:schemaRef ds:uri="e9d15892-5b68-4418-a3e7-94427c2a91b4"/>
-  </ds:schemaRefs>
-</ds:datastoreItem>
-</file>
-
-<file path=customXml/itemProps3.xml><?xml version="1.0" encoding="utf-8"?>
-<ds:datastoreItem xmlns:ds="http://schemas.openxmlformats.org/officeDocument/2006/customXml" ds:itemID="{DC8551FE-7FF0-4CCB-9CCF-13B976D5D205}">
-  <ds:schemaRefs>
-    <ds:schemaRef ds:uri="http://schemas.microsoft.com/sharepoint/v3/contenttype/forms"/>
-  </ds:schemaRefs>
-</ds:datastoreItem>
 </file>
</xml_diff>